<commit_message>
Remove Route Cost Map placeholder module
The module was never started: no mapping data source was agreed and no
corridor distances were measured, so it could not have been populated
without inventing the numbers it displayed.

Removes tab-2 from MODULE_INFO, NAV_ICONS, serve_layout and the
instructions panel, and deletes placeholder_layout and the
MODULES_IN_DEVELOPMENT mechanism, which had nothing left to mark.

Display numbers shift: what was 6, 7 and 8 is now 5, 6 and 7. Guide
renumbered from 34 slides to 33. Report Section 1.4 now says seven
modules and Section 8.3 carries the route map as further work with the
blocker stated.

Also ignores Office ~$ lock files.
</commit_message>
<xml_diff>
--- a/report/EV_Lab_Report_2026.docx
+++ b/report/EV_Lab_Report_2026.docx
@@ -382,7 +382,7 @@
         <w:t xml:space="preserve"> </w:t>
       </w:r>
       <w:r>
-        <w:t xml:space="preserve">of eight modules built in Python using Plotly Dash, covering policy tracking, regional comparison, consumer cost comparison, taxi feasibility, national fleet projection, emissions, and historic fuel prices. Seven modules are complete; a route cost map remains unbuilt and is discussed in Section 8.</w:t>
+        <w:t xml:space="preserve">of seven modules built in Python using Plotly Dash, covering policy tracking, regional comparison, consumer cost comparison, taxi feasibility, national fleet projection, emissions, and historic fuel prices. A route cost map was scoped early in the project but was not built, for the reasons given in Section 8.3, and does not form part of the delivered dashboard.</w:t>
       </w:r>
     </w:p>
     <w:p>
@@ -6299,7 +6299,7 @@
         <w:pStyle w:val="Compact"/>
       </w:pPr>
       <w:r>
-        <w:t xml:space="preserve">Complete the Route Cost Map, the one unbuilt module. Corridor data has been identified: Half Way Tree to Papine, Red Hills, Three Miles, Downtown Crossroads, Manor Park, and Backgate to Spanish Town.</w:t>
+        <w:t xml:space="preserve">Build the Route Cost Map, which was scoped in week 2 as an eighth module and subsequently dropped rather than shipped empty. It was to show operating cost per kilometre across six Kingston route-taxi corridors: Half Way Tree to Papine, Red Hills, Three Miles, Downtown Crossroads, Manor Park, and Backgate to Spanish Town. Two things blocked it. No mapping data source was agreed, and no measured corridor distances were ever collected, so the module could not have been populated without inventing the distances it displayed. The underlying cost per kilometre arithmetic already exists in the Taxi Feasibility Tool, so the work needed is data collection rather than modelling.</w:t>
       </w:r>
     </w:p>
     <w:p>

</xml_diff>